<commit_message>
Finalisation Tache 4 V2 : Intégration Boosting et rapports PDF
</commit_message>
<xml_diff>
--- a/etape2MLOPs.docx
+++ b/etape2MLOPs.docx
@@ -1307,6 +1307,7 @@
       </w:pPr>
     </w:p>
     <w:p>
+      <w:bookmarkStart w:id="0" w:name="_GoBack"/>
       <w:r>
         <w:rPr>
           <w:noProof/>
@@ -1314,8 +1315,8 @@
         <w:lastRenderedPageBreak/>
         <w:drawing>
           <wp:inline distT="0" distB="0" distL="0" distR="0" wp14:anchorId="6DC243E6" wp14:editId="257CBBFE">
-            <wp:extent cx="5974080" cy="4122420"/>
-            <wp:effectExtent l="0" t="0" r="7620" b="0"/>
+            <wp:extent cx="6423660" cy="4122420"/>
+            <wp:effectExtent l="0" t="0" r="0" b="0"/>
             <wp:docPr id="2" name="Picture 2"/>
             <wp:cNvGraphicFramePr>
               <a:graphicFrameLocks xmlns:a="http://schemas.openxmlformats.org/drawingml/2006/main" noChangeAspect="1"/>
@@ -1336,7 +1337,7 @@
                   <pic:spPr>
                     <a:xfrm>
                       <a:off x="0" y="0"/>
-                      <a:ext cx="5972810" cy="4121544"/>
+                      <a:ext cx="6422295" cy="4121544"/>
                     </a:xfrm>
                     <a:prstGeom prst="rect">
                       <a:avLst/>
@@ -1348,6 +1349,7 @@
           </wp:inline>
         </w:drawing>
       </w:r>
+      <w:bookmarkEnd w:id="0"/>
     </w:p>
     <w:p/>
     <w:p/>
@@ -1357,8 +1359,6 @@
       <w:r>
         <w:t>https://colab.research.google.com/drive/1tbNiyQaYKVMOTD0Na-7XdYL33bvCTtTU?usp=sharing</w:t>
       </w:r>
-      <w:bookmarkStart w:id="0" w:name="_GoBack"/>
-      <w:bookmarkEnd w:id="0"/>
     </w:p>
     <w:sectPr>
       <w:pgSz w:w="12240" w:h="15840"/>

</xml_diff>